<commit_message>
Expand test suite (unit + E2E) and update documentation
Moves tests into a tests/ folder, adds tests/test-unit.js (65 assertions
covering pure/near-pure logic functions in app.js, including edge cases
like the Mala View precision guard) and tests/test-e2e.js (27 assertions
driving full user flows: Background themes, Splash rotation, Mala View,
Sankalpa, Today Card, Import/Export, Restore from Backup). Adds an npm
test script running all three suites (120 assertions total, all passing).

package.json is now tracked (previously gitignored) so npm test works
out of the box on a fresh clone.

Updates the technical documentation and README to describe the
Background Theme and Splash Screen rotation features, the new test
suite structure, and the updated project layout (splash/, tests/).

Co-Authored-By: Claude Sonnet 5 <noreply@anthropic.com>
</commit_message>
<xml_diff>
--- a/Sumiran-Lite-Technical-Documentation.docx
+++ b/Sumiran-Lite-Technical-Documentation.docx
@@ -38,9 +38,9 @@
           <w:color w:val="555555"/>
           <w:sz w:val="22"/>
         </w:rPr>
-        <w:t>Version: main @ ff6f1b0 (Sumiran-Lite)</w:t>
+        <w:t>Version: main @ 7af92b8 (Sumiran-Lite)</w:t>
         <w:br/>
-        <w:t>Generated: 01 August 2026</w:t>
+        <w:t>Generated: 03 August 2026</w:t>
         <w:br/>
         <w:t>Repository: github.com/arijeetkundu/jaap-ledger</w:t>
       </w:r>
@@ -192,6 +192,14 @@
       </w:pPr>
       <w:r>
         <w:t>7.10 Splash Screen &amp; PWA Shell</w:t>
+      </w:r>
+    </w:p>
+    <w:p>
+      <w:pPr>
+        <w:ind w:left="283"/>
+      </w:pPr>
+      <w:r>
+        <w:t>7.11 Background Theme</w:t>
       </w:r>
     </w:p>
     <w:p>
@@ -329,10 +337,7 @@
         <w:rPr>
           <w:b/>
         </w:rPr>
-        <w:t xml:space="preserve">Testing: </w:t>
-      </w:r>
-      <w:r>
-        <w:t>Puppeteer-driven browser smoke tests (test.js)</w:t>
+        <w:t>Testing: Puppeteer-driven browser tests — structural smoke tests, pure-logic unit tests, and full user-flow E2E tests (tests/test.js, tests/test-unit.js, tests/test-e2e.js), run via npm test</w:t>
       </w:r>
     </w:p>
     <w:p>
@@ -795,132 +800,84 @@
         <w:br/>
       </w:r>
       <w:r>
-        <w:rPr>
-          <w:rFonts w:ascii="Consolas" w:hAnsi="Consolas"/>
-          <w:color w:val="4A3F18"/>
-          <w:sz w:val="18"/>
-        </w:rPr>
         <w:t>├── index.html                 Page shell; all containers filled by app.js</w:t>
       </w:r>
       <w:r>
         <w:br/>
       </w:r>
       <w:r>
-        <w:rPr>
-          <w:rFonts w:ascii="Consolas" w:hAnsi="Consolas"/>
-          <w:color w:val="4A3F18"/>
-          <w:sz w:val="18"/>
-        </w:rPr>
-        <w:t>├── app.js                     All application logic (~1,390 lines)</w:t>
+        <w:t>├── app.js                     All application logic</w:t>
       </w:r>
       <w:r>
         <w:br/>
       </w:r>
       <w:r>
-        <w:rPr>
-          <w:rFonts w:ascii="Consolas" w:hAnsi="Consolas"/>
-          <w:color w:val="4A3F18"/>
-          <w:sz w:val="18"/>
-        </w:rPr>
         <w:t>├── styles.css                 All styling</w:t>
       </w:r>
       <w:r>
         <w:br/>
       </w:r>
       <w:r>
-        <w:rPr>
-          <w:rFonts w:ascii="Consolas" w:hAnsi="Consolas"/>
-          <w:color w:val="4A3F18"/>
-          <w:sz w:val="18"/>
-        </w:rPr>
         <w:t>├── data.json                  Historical seed data (used only on first-ever load)</w:t>
       </w:r>
       <w:r>
         <w:br/>
       </w:r>
       <w:r>
-        <w:rPr>
-          <w:rFonts w:ascii="Consolas" w:hAnsi="Consolas"/>
-          <w:color w:val="4A3F18"/>
-          <w:sz w:val="18"/>
-        </w:rPr>
         <w:t>├── poornima.json              Static full-moon date fallback list (through 2027)</w:t>
       </w:r>
       <w:r>
         <w:br/>
       </w:r>
       <w:r>
-        <w:rPr>
-          <w:rFonts w:ascii="Consolas" w:hAnsi="Consolas"/>
-          <w:color w:val="4A3F18"/>
-          <w:sz w:val="18"/>
-        </w:rPr>
-        <w:t>├── manifest.json              PWA manifest</w:t>
+        <w:t>├── manifest.json               PWA manifest</w:t>
       </w:r>
       <w:r>
         <w:br/>
       </w:r>
       <w:r>
-        <w:rPr>
-          <w:rFonts w:ascii="Consolas" w:hAnsi="Consolas"/>
-          <w:color w:val="4A3F18"/>
-          <w:sz w:val="18"/>
-        </w:rPr>
-        <w:t>├── hanuman-splash.png/.webp   Splash screen artwork</w:t>
+        <w:t>├── splash/                    5 rotating splash images (.png/.webp pairs)</w:t>
       </w:r>
       <w:r>
         <w:br/>
       </w:r>
       <w:r>
-        <w:rPr>
-          <w:rFonts w:ascii="Consolas" w:hAnsi="Consolas"/>
-          <w:color w:val="4A3F18"/>
-          <w:sz w:val="18"/>
-        </w:rPr>
-        <w:t>├── hanuman-splash-original.png</w:t>
+        <w:t>├── icons/                     App icons (192x192, 512x512) + bg-alpana.webp/bg-mandala.webp tile assets</w:t>
       </w:r>
       <w:r>
         <w:br/>
       </w:r>
       <w:r>
-        <w:rPr>
-          <w:rFonts w:ascii="Consolas" w:hAnsi="Consolas"/>
-          <w:color w:val="4A3F18"/>
-          <w:sz w:val="18"/>
-        </w:rPr>
-        <w:t>├── icons/                     App icons (192x192, 512x512)</w:t>
+        <w:t>├── tests/</w:t>
       </w:r>
       <w:r>
         <w:br/>
       </w:r>
       <w:r>
-        <w:rPr>
-          <w:rFonts w:ascii="Consolas" w:hAnsi="Consolas"/>
-          <w:color w:val="4A3F18"/>
-          <w:sz w:val="18"/>
-        </w:rPr>
-        <w:t>├── test.js                    Puppeteer smoke-test suite</w:t>
+        <w:t>│   ├── test.js                Puppeteer structural smoke tests</w:t>
       </w:r>
       <w:r>
         <w:br/>
       </w:r>
       <w:r>
-        <w:rPr>
-          <w:rFonts w:ascii="Consolas" w:hAnsi="Consolas"/>
-          <w:color w:val="4A3F18"/>
-          <w:sz w:val="18"/>
-        </w:rPr>
-        <w:t>├── package.json                devDependencies: puppeteer, sharp</w:t>
+        <w:t>│   ├── test-unit.js           Puppeteer-driven unit tests for pure logic functions</w:t>
       </w:r>
       <w:r>
         <w:br/>
       </w:r>
       <w:r>
-        <w:rPr>
-          <w:rFonts w:ascii="Consolas" w:hAnsi="Consolas"/>
-          <w:color w:val="4A3F18"/>
-          <w:sz w:val="18"/>
-        </w:rPr>
+        <w:t>│   └── test-e2e.js            Puppeteer full user-flow E2E tests</w:t>
+      </w:r>
+      <w:r>
+        <w:br/>
+      </w:r>
+      <w:r>
+        <w:t>├── package.json                devDependencies: puppeteer, sharp; "test" script runs all 3 suites</w:t>
+      </w:r>
+      <w:r>
+        <w:br/>
+      </w:r>
+      <w:r>
         <w:t>└── package-lock.json</w:t>
       </w:r>
     </w:p>
@@ -1578,6 +1535,70 @@
           </w:p>
         </w:tc>
       </w:tr>
+      <w:tr>
+        <w:tc>
+          <w:tcPr>
+            <w:tcW w:type="dxa" w:w="2880"/>
+          </w:tcPr>
+          <w:p>
+            <w:r>
+              <w:t>backgroundChoice</w:t>
+            </w:r>
+          </w:p>
+        </w:tc>
+        <w:tc>
+          <w:tcPr>
+            <w:tcW w:type="dxa" w:w="2880"/>
+          </w:tcPr>
+          <w:p>
+            <w:r>
+              <w:t>"alpana" / "mandala"</w:t>
+            </w:r>
+          </w:p>
+        </w:tc>
+        <w:tc>
+          <w:tcPr>
+            <w:tcW w:type="dxa" w:w="2880"/>
+          </w:tcPr>
+          <w:p>
+            <w:r>
+              <w:t>Persists the selected tiled background theme (§7.11). Display preference only — never mutates stored ledger data.</w:t>
+            </w:r>
+          </w:p>
+        </w:tc>
+      </w:tr>
+      <w:tr>
+        <w:tc>
+          <w:tcPr>
+            <w:tcW w:type="dxa" w:w="2880"/>
+          </w:tcPr>
+          <w:p>
+            <w:r>
+              <w:t>lastSplashImage</w:t>
+            </w:r>
+          </w:p>
+        </w:tc>
+        <w:tc>
+          <w:tcPr>
+            <w:tcW w:type="dxa" w:w="2880"/>
+          </w:tcPr>
+          <w:p>
+            <w:r>
+              <w:t>one of the 5 SPLASH_IMAGES ids</w:t>
+            </w:r>
+          </w:p>
+        </w:tc>
+        <w:tc>
+          <w:tcPr>
+            <w:tcW w:type="dxa" w:w="2880"/>
+          </w:tcPr>
+          <w:p>
+            <w:r>
+              <w:t>Tracks which splash image was shown on the most recent app open, so the rotation (§7.10) never repeats the same image twice in a row.</w:t>
+            </w:r>
+          </w:p>
+        </w:tc>
+      </w:tr>
     </w:tbl>
     <w:p/>
     <w:p>
@@ -2033,7 +2054,21 @@
     </w:p>
     <w:p>
       <w:r>
-        <w:t>manifest.json declares the app as an installable standalone PWA (theme/background colors, 192px/512px icons, portrait orientation). index.html additionally sets iOS-specific meta tags (apple-mobile-web-app-capable, status bar style, apple-touch-icon/startup-image) for the home-screen install experience on iOS Safari. There is no service worker in the current codebase — offline support comes entirely from IndexedDB data persistence, not from cached network requests.</w:t>
+        <w:t>manifest.json declares the app as an installable standalone PWA (theme/background colors, 192px/512px icons, portrait orientation). index.html additionally sets iOS-specific meta tags (apple-mobile-web-app-capable, status bar style, apple-touch-icon/startup-image) for the home-screen install experience on iOS Safari. There is no service worker in the current codebase — offline support comes entirely from IndexedDB data persistence, not from cached network requests. The splash screen itself now rotates across a pool of 5 images (SPLASH_IMAGES in app.js: the original Hanuman artwork plus four Rama images) — one is chosen at random on every app open, excluding whichever image was shown on the immediately preceding open (tracked via the localStorage key lastSplashImage), so the same image never appears twice in a row, whether the two opens are seconds or days apart.</w:t>
+      </w:r>
+    </w:p>
+    <w:p>
+      <w:pPr>
+        <w:pStyle w:val="Heading2"/>
+      </w:pPr>
+      <w:r>
+        <w:t>7.11 Background Theme</w:t>
+      </w:r>
+    </w:p>
+    <w:p>
+      <w:pPr/>
+      <w:r>
+        <w:t>A Settings (⚙) control lets the user switch the app’s tiled page background between two patterns, Alpana and Mandala (Mandala is the default). The choice is applied as a body.bg-alpana / body.bg-mandala CSS class (background-repeat: repeat, not background-attachment: fixed, to avoid known iOS Safari scroll-rendering bugs with fixed backgrounds) and persisted via the localStorage key backgroundChoice. The Today Card, Reflection Card, and Ledger List keep their own distinct opaque background colors regardless of theme, so the pattern only shows through the page margins and gaps around them. The splash screen (§7.10) applies the same chosen theme as its own backdrop via the same body class, so the two features stay visually consistent.</w:t>
       </w:r>
     </w:p>
     <w:p>
@@ -4073,15 +4108,18 @@
     </w:p>
     <w:p>
       <w:pPr>
-        <w:pStyle w:val="Heading1"/>
-      </w:pPr>
-      <w:r>
-        <w:t>10. Testing</w:t>
+        <w:pStyle w:val="Heading3"/>
+      </w:pPr>
+      <w:r>
+        <w:t>Background Theme &amp; Splash Screen (§7.10 / §7.11)</w:t>
       </w:r>
     </w:p>
     <w:p>
-      <w:r>
-        <w:t>test.js is a Puppeteer-driven end-to-end smoke test (Node, devDependency-only — not shipped to the browser). It launches a headless browser against a locally served copy of the app (http://localhost:3333 by default) and asserts against the rendered DOM. Coverage includes:</w:t>
+      <w:pPr>
+        <w:pStyle w:val="ListBullet"/>
+      </w:pPr>
+      <w:r>
+        <w:t>SPLASH_IMAGES — Pool of 5 {id, webp, png, alt} entries (splash/ folder); chosen randomly on each load, excluding the previous open’s image (localStorage lastSplashImage).</w:t>
       </w:r>
     </w:p>
     <w:p>
@@ -4089,7 +4127,7 @@
         <w:pStyle w:val="ListBullet"/>
       </w:pPr>
       <w:r>
-        <w:t>Core structure: heading, Today Card, Reflection Summary, and Ledger List all render non-empty.</w:t>
+        <w:t>chooseSplashImage() (IIFE, top of app.js) — Runs synchronously before the splash fade-in logic so the correct image is set before first paint; sets #splash-source/#splash-img and persists the choice.</w:t>
       </w:r>
     </w:p>
     <w:p>
@@ -4097,23 +4135,20 @@
         <w:pStyle w:val="ListBullet"/>
       </w:pPr>
       <w:r>
-        <w:t>Progress bar: track/fill exist, width is a valid percentage, label contains the expected ‘/’.</w:t>
+        <w:t>updateBackgroundSwatchButtons() — Toggles the .active class on the currently-selected .background-swatch button in the Settings drawer, mirroring updateMalaToggleButton()’s pattern.</w:t>
       </w:r>
     </w:p>
     <w:p>
       <w:pPr>
-        <w:pStyle w:val="ListBullet"/>
-      </w:pPr>
-      <w:r>
-        <w:t>Jump-to-year: selector has year options; selecting the oldest year expands and scrolls to it.</w:t>
+        <w:pStyle w:val="Heading1"/>
+      </w:pPr>
+      <w:r>
+        <w:t>10. Testing</w:t>
       </w:r>
     </w:p>
     <w:p>
-      <w:pPr>
-        <w:pStyle w:val="ListBullet"/>
-      </w:pPr>
-      <w:r>
-        <w:t>Ledger rows: rows render; chevron click expands/collapses a row.</w:t>
+      <w:r>
+        <w:t>The test suite lives under tests/ and is split into three Puppeteer-driven Node scripts (devDependency-only — none of this ships to the browser), all run against a locally served copy of the app (http://localhost:3333 by default): tests/test.js (structural smoke tests, unchanged from earlier revisions), tests/test-unit.js (pure-logic unit tests), and tests/test-e2e.js (full user-flow E2E tests). tests/test.js asserts against the rendered DOM. Coverage includes:</w:t>
       </w:r>
     </w:p>
     <w:p>
@@ -4121,7 +4156,7 @@
         <w:pStyle w:val="ListBullet"/>
       </w:pPr>
       <w:r>
-        <w:t>Locked entries: at least one row shows the 🔒 locked-note with the correct text.</w:t>
+        <w:t>Core structure: heading, Today Card, Reflection Summary, and Ledger List all render non-empty.</w:t>
       </w:r>
     </w:p>
     <w:p>
@@ -4129,7 +4164,7 @@
         <w:pStyle w:val="ListBullet"/>
       </w:pPr>
       <w:r>
-        <w:t>Poornima keyword detection across all supported variants (English + Devanagari).</w:t>
+        <w:t>Progress bar: track/fill exist, width is a valid percentage, label contains the expected ‘/’.</w:t>
       </w:r>
     </w:p>
     <w:p>
@@ -4137,7 +4172,7 @@
         <w:pStyle w:val="ListBullet"/>
       </w:pPr>
       <w:r>
-        <w:t>Date format matches “D MMM YYYY”.</w:t>
+        <w:t>Jump-to-year: selector has year options; selecting the oldest year expands and scrolls to it.</w:t>
       </w:r>
     </w:p>
     <w:p>
@@ -4145,7 +4180,7 @@
         <w:pStyle w:val="ListBullet"/>
       </w:pPr>
       <w:r>
-        <w:t>Save flow: updating Today Card's jaap value shows a toast that later auto-dismisses.</w:t>
+        <w:t>Ledger rows: rows render; chevron click expands/collapses a row.</w:t>
       </w:r>
     </w:p>
     <w:p>
@@ -4153,17 +4188,165 @@
         <w:pStyle w:val="ListBullet"/>
       </w:pPr>
       <w:r>
-        <w:t>No uncaught JS errors or console errors during the whole run.</w:t>
+        <w:t>Locked entries: at least one row shows the 🔒 locked-note with the correct text.</w:t>
       </w:r>
     </w:p>
     <w:p>
-      <w:r>
-        <w:t>Run it with: node test.js, against an app already being served (e.g. via python -m http.server 3333 in the project root).</w:t>
+      <w:pPr>
+        <w:pStyle w:val="ListBullet"/>
+      </w:pPr>
+      <w:r>
+        <w:t>Poornima keyword detection across all supported variants (English + Devanagari).</w:t>
       </w:r>
     </w:p>
     <w:p>
-      <w:r>
-        <w:t>Note: this suite predates the Sumiran-Lite feature set (sparkline, milestone predictions, Sankalpa, Mala View) and does not yet assert against them; those were verified with ad hoc Puppeteer scripts during development but are not part of the checked-in suite.</w:t>
+      <w:pPr>
+        <w:pStyle w:val="ListBullet"/>
+      </w:pPr>
+      <w:r>
+        <w:t>Date format matches “D MMM YYYY”.</w:t>
+      </w:r>
+    </w:p>
+    <w:p>
+      <w:pPr>
+        <w:pStyle w:val="ListBullet"/>
+      </w:pPr>
+      <w:r>
+        <w:t>Save flow: updating Today Card's jaap value shows a toast that later auto-dismisses.</w:t>
+      </w:r>
+    </w:p>
+    <w:p>
+      <w:pPr>
+        <w:pStyle w:val="ListBullet"/>
+      </w:pPr>
+      <w:r>
+        <w:t>No uncaught JS errors or console errors during the whole run.</w:t>
+      </w:r>
+    </w:p>
+    <w:p>
+      <w:pPr/>
+      <w:r>
+        <w:t>tests/test-unit.js calls global pure/near-pure logic functions directly (top-level function declarations in app.js attach to window in a plain &lt;script&gt;, so they’re reachable via page.evaluate(() =&gt; fnName(...))). Coverage includes:</w:t>
+      </w:r>
+    </w:p>
+    <w:p>
+      <w:pPr>
+        <w:pStyle w:val="ListBullet"/>
+      </w:pPr>
+      <w:r>
+        <w:t>formatIndianNumber, jaapToMala/malaToJaap/formatAsMala, addDaysISO, isSunday, and escapeHTML, including null/undefined/negative-number edge cases.</w:t>
+      </w:r>
+    </w:p>
+    <w:p>
+      <w:pPr>
+        <w:pStyle w:val="ListBullet"/>
+      </w:pPr>
+      <w:r>
+        <w:t>Milestone math: getCurrentMilestone/getMilestoneProgress (including the exact-crore-multiple → 0% edge case), getMilestoneHistory (empty input, out-of-order entries, a single entry crossing multiple Crore brackets at once), sumJaapInRange (null-jaap exclusion, inclusive boundary dates), and projectMilestoneFromPace (falsy/negative pace → null).</w:t>
+      </w:r>
+    </w:p>
+    <w:p>
+      <w:pPr>
+        <w:pStyle w:val="ListBullet"/>
+      </w:pPr>
+      <w:r>
+        <w:t>Sparkline data helpers: buildDateJaapMap, getRollingWindow (missing days skipped rather than zero-filled, empty windows), and renderSparklineSVG (empty/single-point/all-equal-value inputs).</w:t>
+      </w:r>
+    </w:p>
+    <w:p>
+      <w:pPr>
+        <w:pStyle w:val="ListBullet"/>
+      </w:pPr>
+      <w:r>
+        <w:t>hasExplicitPoornima across English (case-insensitive) and Devanagari keyword variants, plus null/empty notes.</w:t>
+      </w:r>
+    </w:p>
+    <w:p>
+      <w:pPr>
+        <w:pStyle w:val="ListBullet"/>
+      </w:pPr>
+      <w:r>
+        <w:t>isWithinLastNDays / isEditableEntry at the exact 7-day boundary and for future dates.</w:t>
+      </w:r>
+    </w:p>
+    <w:p>
+      <w:pPr>
+        <w:pStyle w:val="ListBullet"/>
+      </w:pPr>
+      <w:r>
+        <w:t>computeJaapFromInput’s precision guard — the most important case: an unchanged floored mala value with a legacy non-multiple-of-108 original jaap must preserve that original exactly, versus an actually-changed input recomputing normally. Mala View is toggled via the real #mala-toggle checkbox (not by injecting state directly) since malaViewEnabled is a module-scoped let and isn’t reachable on window.</w:t>
+      </w:r>
+    </w:p>
+    <w:p>
+      <w:pPr/>
+      <w:r>
+        <w:t>tests/test-e2e.js drives full user flows through the real UI. Coverage includes:</w:t>
+      </w:r>
+    </w:p>
+    <w:p>
+      <w:pPr>
+        <w:pStyle w:val="ListBullet"/>
+      </w:pPr>
+      <w:r>
+        <w:t>Background theme: defaults to Mandala on first-ever load; clicking each Settings swatch swaps the body class, persists to localStorage.backgroundChoice, and survives a reload; the splash screen picks up the same chosen theme.</w:t>
+      </w:r>
+    </w:p>
+    <w:p>
+      <w:pPr>
+        <w:pStyle w:val="ListBullet"/>
+      </w:pPr>
+      <w:r>
+        <w:t>Splash rotation: across repeated reloads, the shown image (tracked via localStorage.lastSplashImage) never repeats on two consecutive opens.</w:t>
+      </w:r>
+    </w:p>
+    <w:p>
+      <w:pPr>
+        <w:pStyle w:val="ListBullet"/>
+      </w:pPr>
+      <w:r>
+        <w:t>Mala View toggle: switching it changes the Today Card input label and persists across reload.</w:t>
+      </w:r>
+    </w:p>
+    <w:p>
+      <w:pPr>
+        <w:pStyle w:val="ListBullet"/>
+      </w:pPr>
+      <w:r>
+        <w:t>Today Card update: entering a jaap value and saving shows the toast and updates the field.</w:t>
+      </w:r>
+    </w:p>
+    <w:p>
+      <w:pPr>
+        <w:pStyle w:val="ListBullet"/>
+      </w:pPr>
+      <w:r>
+        <w:t>Sankalpa: the establish flow (button disabled until text is entered) and the rewrite flow (confirm() dialog handled via page.on(‘dialog’, ...)), asserting the original establishment date is preserved after a rewrite.</w:t>
+      </w:r>
+    </w:p>
+    <w:p>
+      <w:pPr>
+        <w:pStyle w:val="ListBullet"/>
+      </w:pPr>
+      <w:r>
+        <w:t>Import/Export: export is verified by intercepting the Blob via a URL.createObjectURL override and parsing its JSON; import is driven via input.uploadFile() with a crafted fixture, asserting the ledger row count updates (accounting for the auto-created “today” entry).</w:t>
+      </w:r>
+    </w:p>
+    <w:p>
+      <w:pPr>
+        <w:pStyle w:val="ListBullet"/>
+      </w:pPr>
+      <w:r>
+        <w:t>Restore from Backup: verified both via the rendered ledger row count and by reading the ledger-backups IndexedDB object store directly (via page.evaluate(() =&gt; window.openDB())).</w:t>
+      </w:r>
+    </w:p>
+    <w:p>
+      <w:r>
+        <w:t>Run the full suite with: npm test (equivalent to node tests/test.js &amp;&amp; node tests/test-unit.js &amp;&amp; node tests/test-e2e.js), against an app already being served (e.g. via python -m http.server 3333 in the project root). Each file can also be run individually, e.g. node tests/test-unit.js.</w:t>
+      </w:r>
+    </w:p>
+    <w:p>
+      <w:r>
+        <w:t>As of this revision, the full Sumiran-Lite feature set — sparkline, milestone predictions, Sankalpa, Mala View, Background Theme, and Splash rotation — has direct automated coverage across the three suites (120 assertions total at time of writing). There is no CI pipeline configured (no GitHub Actions or equivalent), so npm test must currently be run locally before pushing.</w:t>
       </w:r>
     </w:p>
     <w:p>
@@ -4493,10 +4676,7 @@
         <w:rPr>
           <w:b/>
         </w:rPr>
-        <w:t xml:space="preserve">Automated tests don't cover Sumiran-Lite features </w:t>
-      </w:r>
-      <w:r>
-        <w:t>(sparkline, milestone predictions, Sankalpa, Mala View) — see §10.</w:t>
+        <w:t>No CI pipeline: npm test (tests/test.js, tests/test-unit.js, tests/test-e2e.js) must currently be run locally before pushing — there is no GitHub Actions workflow or other CI wiring to run it automatically.</w:t>
       </w:r>
     </w:p>
     <w:p>
@@ -4742,6 +4922,50 @@
                 <w:sz w:val="19"/>
               </w:rPr>
               <w:t>The internal codename for the feature set added in this documentation's referenced commit: sparkline, milestone predictions, Sankalpa, and Mala View.</w:t>
+            </w:r>
+          </w:p>
+        </w:tc>
+      </w:tr>
+      <w:tr>
+        <w:tc>
+          <w:tcPr>
+            <w:tcW w:type="dxa" w:w="4320"/>
+          </w:tcPr>
+          <w:p>
+            <w:r>
+              <w:t>Alpana</w:t>
+            </w:r>
+          </w:p>
+        </w:tc>
+        <w:tc>
+          <w:tcPr>
+            <w:tcW w:type="dxa" w:w="4320"/>
+          </w:tcPr>
+          <w:p>
+            <w:r>
+              <w:t>A traditional decorative floor-art pattern; one of the two selectable tiled page background themes (§7.11).</w:t>
+            </w:r>
+          </w:p>
+        </w:tc>
+      </w:tr>
+      <w:tr>
+        <w:tc>
+          <w:tcPr>
+            <w:tcW w:type="dxa" w:w="4320"/>
+          </w:tcPr>
+          <w:p>
+            <w:r>
+              <w:t>Mandala</w:t>
+            </w:r>
+          </w:p>
+        </w:tc>
+        <w:tc>
+          <w:tcPr>
+            <w:tcW w:type="dxa" w:w="4320"/>
+          </w:tcPr>
+          <w:p>
+            <w:r>
+              <w:t>A circular sacred-geometry pattern; the other selectable tiled page background theme (§7.11) and the app’s default.</w:t>
             </w:r>
           </w:p>
         </w:tc>

</xml_diff>

<commit_message>
Remove dead code and unused CSS rules
Removes isStandalonePWA(), loadFromLocalStorage(), and
saveToLocalStorage() from app.js (zero call sites anywhere, including
tests -- legacy leftovers from before IndexedDB storage), and four
unused CSS rules (.maintenance-title, .restore-btn/.restore-btn:hover,
.year-line, .yearly-totals) with no matching class in any markup.

Found via a full audit of function call sites and CSS selector usage.
Updates the technical documentation to match (removes now-stale "dead
code" callouts, rephrases the localStorage note to past tense).

Co-Authored-By: Claude Sonnet 5 <noreply@anthropic.com>
</commit_message>
<xml_diff>
--- a/Sumiran-Lite-Technical-Documentation.docx
+++ b/Sumiran-Lite-Technical-Documentation.docx
@@ -1603,7 +1603,7 @@
     <w:p/>
     <w:p>
       <w:r>
-        <w:t>Note: two legacy helper functions, loadFromLocalStorage() and saveToLocalStorage(), still exist in app.js targeting a “jaap-ledger” localStorage key, but are not called anywhere in the current codebase — they are dead code left over from an earlier storage design, superseded by IndexedDB. See §12.</w:t>
+        <w:t>Note: two legacy helper functions, loadFromLocalStorage() and saveToLocalStorage(), previously existed in app.js targeting a “jaap-ledger” localStorage key. They were unused dead code (superseded by IndexedDB) and have since been removed.</w:t>
       </w:r>
     </w:p>
     <w:p>
@@ -4102,11 +4102,6 @@
     </w:tbl>
     <w:p/>
     <w:p>
-      <w:r>
-        <w:t>Dead code / unused: isStandalonePWA(), loadFromLocalStorage(), and saveToLocalStorage() are defined but not called anywhere in the current codebase (see §12).</w:t>
-      </w:r>
-    </w:p>
-    <w:p>
       <w:pPr>
         <w:pStyle w:val="Heading3"/>
       </w:pPr>
@@ -4624,20 +4619,6 @@
       </w:r>
       <w:r>
         <w:t>all app.js functions are global; there is no import/export boundary, so naming collisions are prevented only by convention, and the whole file must load and execute in order for the app to bootstrap correctly.</w:t>
-      </w:r>
-    </w:p>
-    <w:p>
-      <w:pPr>
-        <w:pStyle w:val="ListBullet"/>
-      </w:pPr>
-      <w:r>
-        <w:rPr>
-          <w:b/>
-        </w:rPr>
-        <w:t xml:space="preserve">Dead code: </w:t>
-      </w:r>
-      <w:r>
-        <w:t>isStandalonePWA(), loadFromLocalStorage(), and saveToLocalStorage() are defined but never called — remnants of an earlier storage design, superseded by IndexedDB.</w:t>
       </w:r>
     </w:p>
     <w:p>

</xml_diff>

<commit_message>
Update documentation for the typography and label changes
README/CLAUDE.md: mention self-hosted Playfair Display + Inter fonts
(fonts/, no CDN), the form-control font-family reset, and bump the
assertion count reference. Also tidies the new workflow note in
CLAUDE.md into the existing bullet-list style.

Technical Documentation: describes the self-hosted variable-font
setup, updates the Reflection Card field order/labels (Lifetime Jaap
first, pace predictions in a bordered panel, diya emoji on
milestones), the Today Card's new formatDateLong()/labels/Save button,
and adds formatDateLong to the function reference.

User Guide: same updates in plain-language form (Save button, Jaap
Count/Mala Count labels, Reflection Summary order, diya emoji).

Co-Authored-By: Claude Sonnet 5 <noreply@anthropic.com>
</commit_message>
<xml_diff>
--- a/Sumiran-Lite-Technical-Documentation.docx
+++ b/Sumiran-Lite-Technical-Documentation.docx
@@ -37,7 +37,7 @@
           <w:color w:val="555555"/>
           <w:sz w:val="22"/>
         </w:rPr>
-        <w:t>Version: main @ b4d5613 (Sumiran-Lite)</w:t>
+        <w:t>Version: main @ 50caa04 (Sumiran-Lite)</w:t>
       </w:r>
       <w:r>
         <w:br/>
@@ -47,7 +47,7 @@
           <w:color w:val="555555"/>
           <w:sz w:val="22"/>
         </w:rPr>
-        <w:t>Generated: 05 August 2026</w:t>
+        <w:t>Generated: 06 August 2026</w:t>
       </w:r>
       <w:r>
         <w:br/>
@@ -275,7 +275,7 @@
     <w:p/>
     <w:p>
       <w:r>
-        <w:t>styles.css centers on a small set of CSS custom properties (design tokens) defined on :root — --maroon, --maroon-deep, --maroon-red, --gold, --gold-hairline, --gold-light, --ink, --ink-muted, --cream, --surface, --surface-2, --font-heading, --ease-premium — which every themed component (cards, buttons, the splash frame, progress bars) draws from, rather than hardcoding colors per rule. See §7.12.</w:t>
+        <w:t>styles.css centers on a small set of CSS custom properties (design tokens) defined on :root — --maroon, --maroon-deep, --maroon-red, --gold, --gold-hairline, --gold-light, --ink, --ink-muted, --cream, --surface, --surface-2, --font-heading, --font-body, --ease-premium — which every themed component (cards, buttons, the splash frame, progress bars) draws from, rather than hardcoding colors per rule. See §7.12.</w:t>
       </w:r>
     </w:p>
     <w:tbl>
@@ -688,6 +688,16 @@
           <w:rFonts w:ascii="Consolas" w:hAnsi="Consolas"/>
           <w:sz w:val="18"/>
         </w:rPr>
+        <w:t>├── fonts/                              Self-hosted Playfair Display + Inter (variable .woff2, no CDN)</w:t>
+      </w:r>
+      <w:r>
+        <w:br/>
+      </w:r>
+      <w:r>
+        <w:rPr>
+          <w:rFonts w:ascii="Consolas" w:hAnsi="Consolas"/>
+          <w:sz w:val="18"/>
+        </w:rPr>
         <w:t>├── splash/</w:t>
       </w:r>
       <w:r>
@@ -1127,7 +1137,7 @@
     </w:p>
     <w:p>
       <w:r>
-        <w:t>Shows today's date, an input for the jaap (or mala) count, a notes textarea, and an Update button. Editable only while the entry falls within the last 7 days (isWithinLastNDays); the Update button is replaced with a locked message otherwise. Displays a 🌕 marker if the notes field contains an explicit Poornima keyword.</w:t>
+        <w:t>Shows today's date in full, bold form (e.g. “Thursday, 6 August 2026”, via formatDateLong() — kept separate from the shorter formatDate() used everywhere else, see §9), a “Jaap Count” (or “Mala Count”, in Mala View) input, a Notes textarea, and a Save button. Editable only while the entry falls within the last 7 days (isWithinLastNDays); the Save button is replaced with a locked message otherwise. Displays a 🌕 marker if the notes field contains an explicit Poornima keyword.</w:t>
       </w:r>
     </w:p>
     <w:p>
@@ -1148,7 +1158,7 @@
         <w:pStyle w:val="ListBullet"/>
       </w:pPr>
       <w:r>
-        <w:t>Current year total and lifetime total (Indian digit grouping, or Mala-converted when Mala View is on).</w:t>
+        <w:t>Lifetime Jaap and {year} Total (Indian digit grouping, or Mala-converted when Mala View is on).</w:t>
       </w:r>
     </w:p>
     <w:p>
@@ -1164,7 +1174,7 @@
         <w:pStyle w:val="ListBullet"/>
       </w:pPr>
       <w:r>
-        <w:t>30-Day Pace and YTD Pace predicted completion dates, each shown only when computable (§8.3).</w:t>
+        <w:t>30-Day Pace and YTD Pace predicted completion dates, each shown only when computable (§8.3), contained in their own bordered, tinted panel (.reflection-predictions) rather than as bare lines.</w:t>
       </w:r>
     </w:p>
     <w:p>
@@ -1172,7 +1182,7 @@
         <w:pStyle w:val="ListBullet"/>
       </w:pPr>
       <w:r>
-        <w:t>Full milestone history: every Crore boundary crossed, with date and days-since-previous.</w:t>
+        <w:t>Full milestone history: every Crore boundary crossed, prefixed with a 🪔 diya emoji, with date and days-since-previous.</w:t>
       </w:r>
     </w:p>
     <w:p>
@@ -1514,7 +1524,20 @@
     </w:p>
     <w:p>
       <w:r>
-        <w:t>The app's visual language (“Temple Gold &amp; Maroon”) is built from a small token system in styles.css: --maroon (#6c1c27) and its variants for primary UI chrome, --gold / --gold-hairline / --gold-light for borders, accents, and progress fills, --cream / --surface / --surface-2 for card backgrounds, and --font-heading (a serif stack led by Georgia) for headings. Every themed component — the heading, Today Card, buttons, progress bar, and the splash frame — draws from these tokens rather than hardcoding colors, keeping the palette centrally adjustable.</w:t>
+        <w:t>The app's visual language (“Temple Gold &amp; Maroon”) is built from a small token system in styles.css: --maroon (#6c1c27) and its variants for primary UI chrome, --gold / --gold-hairline / --gold-light for borders, accents, and progress fills, --cream / --surface / --surface-2 for card backgrounds, --font-heading (Playfair Display, for headings) and --font-body (Inter, for body text, counts, and UI labels). Every themed component — the heading, Today Card, buttons, progress bar, and the splash frame — draws from these tokens rather than hardcoding colors, keeping the palette centrally adjustable.</w:t>
+      </w:r>
+    </w:p>
+    <w:p>
+      <w:pPr>
+        <w:pStyle w:val="Heading3"/>
+      </w:pPr>
+      <w:r>
+        <w:t>7.12.0 Self-hosted typography</w:t>
+      </w:r>
+    </w:p>
+    <w:p>
+      <w:r>
+        <w:t>Both typefaces are self-hosted as variable-font .woff2 files under fonts/ (Inter-Variable.woff2, PlayfairDisplay-Variable.woff2) rather than linked from a font CDN, keeping the app fully functional offline. Each is declared with a single @font-face using a font-weight range (400 700), letting one file serve every weight already used in the stylesheet rather than needing a separate file per weight. Form controls (input/button/textarea/select) receive an explicit font-family: inherit reset, since browsers don't apply the body font-family to form elements by default — without it, jaap/mala counts and button labels would silently render in the platform's UI font instead of Inter.</w:t>
       </w:r>
     </w:p>
     <w:p>
@@ -1900,7 +1923,31 @@
           <w:p>
             <w:r/>
             <w:r>
-              <w:t>YYYY-MM-DD → “D MMM YYYY”</w:t>
+              <w:t>YYYY-MM-DD → “D MMM YYYY” — used everywhere except the Today Card</w:t>
+            </w:r>
+          </w:p>
+        </w:tc>
+      </w:tr>
+      <w:tr>
+        <w:tc>
+          <w:tcPr>
+            <w:tcW w:type="dxa" w:w="4320"/>
+          </w:tcPr>
+          <w:p>
+            <w:r/>
+            <w:r>
+              <w:t>formatDateLong(isoDate)</w:t>
+            </w:r>
+          </w:p>
+        </w:tc>
+        <w:tc>
+          <w:tcPr>
+            <w:tcW w:type="dxa" w:w="4320"/>
+          </w:tcPr>
+          <w:p>
+            <w:r/>
+            <w:r>
+              <w:t>YYYY-MM-DD → “Weekday, D Month YYYY” — Today Card only (§7.1)</w:t>
             </w:r>
           </w:p>
         </w:tc>

</xml_diff>

<commit_message>
Update documentation for the audit fixes and typography/label changes
CLAUDE.md/README: bump assertion count to 195; add architecture notes
on the todayISO refresh fix, the escapeHTML() coverage on notes
rendering, and the getCroreMilestone Map-based lookup optimization;
update the dialog-testing convention note now that test-e2e.js gates
its single dialog handler on a shared shouldAcceptDialogs flag instead
of always accepting.

Technical Documentation: removed the now-fixed "unescaped notes" known
limitation, updated the todayISO limitation to reflect that it
self-corrects on the next render instead of staying stale for the rest
of the session, bumped the assertion count.

User Guide: updated every reference to Hanuman to "Gurudev Hanuman Ji",
matching the app's own updated Settings copy.

Co-Authored-By: Claude Sonnet 5 <noreply@anthropic.com>
</commit_message>
<xml_diff>
--- a/Sumiran-Lite-Technical-Documentation.docx
+++ b/Sumiran-Lite-Technical-Documentation.docx
@@ -37,7 +37,7 @@
           <w:color w:val="555555"/>
           <w:sz w:val="22"/>
         </w:rPr>
-        <w:t>Version: main @ 50caa04 (Sumiran-Lite)</w:t>
+        <w:t>Version: main @ 48d28c5 (Sumiran-Lite)</w:t>
       </w:r>
       <w:r>
         <w:br/>
@@ -250,7 +250,7 @@
         <w:pStyle w:val="ListBullet"/>
       </w:pPr>
       <w:r>
-        <w:t>Testing: Puppeteer-driven browser tests across 5 suites — structural smoke tests, pure-logic unit tests, full user-flow E2E tests, premium-redesign tests, and custom-splash-image tests (tests/*.js), 184 assertions total as of this revision, run via npm test</w:t>
+        <w:t>Testing: Puppeteer-driven browser tests across 5 suites — structural smoke tests, pure-logic unit tests, full user-flow E2E tests, premium-redesign tests, and custom-splash-image tests (tests/*.js), 195 assertions total as of this revision, run via npm test</w:t>
       </w:r>
     </w:p>
     <w:p>
@@ -3508,7 +3508,7 @@
     </w:p>
     <w:p>
       <w:r>
-        <w:t>The test suite lives under tests/ and is split into five Puppeteer-driven Node scripts (devDependency-only — none of this ships to the browser), all run against a locally served copy of the app (http://localhost:3333 by default): tests/test.js, tests/test-unit.js, tests/test-e2e.js, tests/test-redesign.js, and tests/test-splash-custom.js. 184 assertions pass across the full suite as of this revision.</w:t>
+        <w:t>The test suite lives under tests/ and is split into five Puppeteer-driven Node scripts (devDependency-only — none of this ships to the browser), all run against a locally served copy of the app (http://localhost:3333 by default): tests/test.js, tests/test-unit.js, tests/test-e2e.js, tests/test-redesign.js, and tests/test-splash-custom.js. 195 assertions pass across the full suite as of this revision.</w:t>
       </w:r>
     </w:p>
     <w:p>
@@ -4097,7 +4097,7 @@
         <w:pStyle w:val="ListBullet"/>
       </w:pPr>
       <w:r>
-        <w:t>Unescaped notes rendering: the notes field is inserted into the DOM via innerHTML without HTML-escaping in the Ledger List and Today Card (unlike Sankalpa text, which is escaped). Since notes are entirely user-authored on a single-user, client-only app, this is a low-severity, self-XSS-only concern under the current data model.</w:t>
+        <w:t>7-day editable window is hardcoded in two separate places (isEditableEntry() and updateTodayEntry()'s isWithinLastNDays(entry.date, 7) check) rather than a single shared constant.</w:t>
       </w:r>
     </w:p>
     <w:p>
@@ -4105,7 +4105,7 @@
         <w:pStyle w:val="ListBullet"/>
       </w:pPr>
       <w:r>
-        <w:t>7-day editable window is hardcoded in two separate places (isEditableEntry() and updateTodayEntry()'s isWithinLastNDays(entry.date, 7) check) rather than a single shared constant.</w:t>
+        <w:t>No CI pipeline: npm test (5 suites) must currently be run locally before pushing — there is no GitHub Actions workflow or other CI wiring to run it automatically.</w:t>
       </w:r>
     </w:p>
     <w:p>
@@ -4113,15 +4113,7 @@
         <w:pStyle w:val="ListBullet"/>
       </w:pPr>
       <w:r>
-        <w:t>No CI pipeline: npm test (5 suites) must currently be run locally before pushing — there is no GitHub Actions workflow or other CI wiring to run it automatically.</w:t>
-      </w:r>
-    </w:p>
-    <w:p>
-      <w:pPr>
-        <w:pStyle w:val="ListBullet"/>
-      </w:pPr>
-      <w:r>
-        <w:t>todayISO is computed once at load and reused as a session-lifetime constant; a date rollover while the app is left open won't be picked up without a page reload.</w:t>
+        <w:t>todayISO is refreshed at the top of every renderToday() call (fixed from an earlier session-lifetime-constant bug — see §9), so it self-corrects on the next save or interaction; a tab left genuinely idle across midnight with no interaction at all still won't reflect the new date until something triggers a re-render, since there's no background timer.</w:t>
       </w:r>
     </w:p>
     <w:p>

</xml_diff>

<commit_message>
Document the four deferred-issue fixes
CLAUDE.md/README.md: updated the todayISO note to describe the
visibilitychange fix, added notes on the isValidJaapValue() guard,
the buildYearRows() lazy-year-build optimization, the shared
celebrateMilestone() check across both save paths, and a callout that
escapeHTML() must never be reused to build an HTML attribute value
from untrusted text. Assertion count updated to 290.

Both .docx deliverables: replaced the now-stale todayISO Known
Limitations bullet, added the lazy-year-build and shared-validation
notes to Technical Documentation §7.3, two new Function Reference
rows (isValidJaapValue, buildYearRows), and a User Guide note that
the Crore celebration now fires from Ledger-row edits too.

Co-Authored-By: Claude Sonnet 5 <noreply@anthropic.com>
</commit_message>
<xml_diff>
--- a/Sumiran-Lite-Technical-Documentation.docx
+++ b/Sumiran-Lite-Technical-Documentation.docx
@@ -37,7 +37,7 @@
           <w:color w:val="555555"/>
           <w:sz w:val="22"/>
         </w:rPr>
-        <w:t>Version: main @ 9c4b60d (Sumiran-Lite)</w:t>
+        <w:t>Version: main @ d0f5926 (Sumiran-Lite)</w:t>
         <w:br/>
         <w:t>Generated: 08 August 2026</w:t>
         <w:br/>
@@ -1228,8 +1228,14 @@
       </w:r>
     </w:p>
     <w:p>
-      <w:r>
-        <w:t>Each row shows date, jaap/mala count, and a sparkline (§7.4), and expands on chevron click to reveal notes and (if within the 7-day editable window) an inline edit form; otherwise a 🔒 “Entry locked” notice. Sundays are highlighted; a marker appears on the date of any Crore-crossing entry, alongside a “Crore Jaap Completed” banner inside the expanded row and a page-wide falling-petal celebration (§7.12).</w:t>
+      <w:pPr/>
+      <w:r>
+        <w:t>For performance on ledgers spanning several years of daily entries, only the current (expanded-by-default) year's rows are built into the DOM eagerly on each render; other years' row DOM and event listeners are built lazily — once, the first time that year is actually expanded (via its header or “Jump to year”) — and cached from then on for that render pass, via buildYearRows() (see §9).</w:t>
+      </w:r>
+    </w:p>
+    <w:p>
+      <w:r>
+        <w:t>Each row shows date, jaap/mala count, and a sparkline (§7.4), and expands on chevron click to reveal notes and (if within the 7-day editable window) an inline edit form; otherwise a 🔒 “Entry locked” notice. Sundays are highlighted; a marker appears on the date of any Crore-crossing entry, alongside a “Crore Jaap Completed” banner inside the expanded row and a page-wide falling-petal celebration (§7.12) — triggered identically whether the crossing entry was saved from the Today Card or from an in-place Ledger row edit. Both save paths validate the parsed jaap value via isValidJaapValue() (§9) before persisting it — a NaN or negative value shows a toast and aborts the save rather than being written to IndexedDB.</w:t>
       </w:r>
     </w:p>
     <w:p>
@@ -2921,6 +2927,28 @@
           </w:p>
         </w:tc>
       </w:tr>
+      <w:tr>
+        <w:tc>
+          <w:tcPr>
+            <w:tcW w:type="dxa" w:w="4320"/>
+          </w:tcPr>
+          <w:p>
+            <w:r>
+              <w:t>isValidJaapValue(value)</w:t>
+            </w:r>
+          </w:p>
+        </w:tc>
+        <w:tc>
+          <w:tcPr>
+            <w:tcW w:type="dxa" w:w="4320"/>
+          </w:tcPr>
+          <w:p>
+            <w:r>
+              <w:t>True for null (no entry) or any finite, non-negative number — guards both save paths against writing NaN/negative values</w:t>
+            </w:r>
+          </w:p>
+        </w:tc>
+      </w:tr>
     </w:tbl>
     <w:p>
       <w:pPr>
@@ -3255,6 +3283,28 @@
             <w:r/>
             <w:r>
               <w:t>Transient confirmation/error toast</w:t>
+            </w:r>
+          </w:p>
+        </w:tc>
+      </w:tr>
+      <w:tr>
+        <w:tc>
+          <w:tcPr>
+            <w:tcW w:type="dxa" w:w="4320"/>
+          </w:tcPr>
+          <w:p>
+            <w:r>
+              <w:t>buildYearRows(yearContainer, entries, deps)</w:t>
+            </w:r>
+          </w:p>
+        </w:tc>
+        <w:tc>
+          <w:tcPr>
+            <w:tcW w:type="dxa" w:w="4320"/>
+          </w:tcPr>
+          <w:p>
+            <w:r>
+              <w:t>Builds one year's row DOM + listeners; called eagerly for the current year, lazily (once, cached) for any other year on first expand</w:t>
             </w:r>
           </w:p>
         </w:tc>
@@ -4722,7 +4772,7 @@
         <w:pStyle w:val="ListBullet"/>
       </w:pPr>
       <w:r>
-        <w:t>todayISO is refreshed at the top of every renderToday() call (fixed from an earlier session-lifetime-constant bug — see §9), so it self-corrects on the next save or interaction; a tab left genuinely idle across midnight with no interaction at all still won't reflect the new date until something triggers a re-render, since there's no background timer.</w:t>
+        <w:t>todayISO is refreshed at the top of every renderToday() call, and also by a document visibilitychange listener that re-renders whenever the app returns to the foreground with a stale date — this closes the one remaining gap (a tab or backgrounded PWA left genuinely idle across midnight with zero interaction), which previously required some other action (a save, a toggle) to notice the date had changed.</w:t>
       </w:r>
     </w:p>
     <w:p>

</xml_diff>

<commit_message>
Fix stale Poornima keyword documentation (missing Bangla)
hasExplicitPoornima() was updated during the i18n work to also
recognize the Bangla spelling (পূর্ণিমা), but the docs describing it
were never updated to match -- found via user review of the User
Guide. Corrected all 4 places this was described: Technical
Documentation's §7.3 Poornima detection paragraph and two Testing
section bullets (§10.1, §10.2), plus the User Guide's §4 Today Card
bullet. Also swept both documents for any other Devanagari-only
mentions that might have the same staleness -- none found; every
other language-specific reference already correctly includes Bangla.

Co-Authored-By: Claude Sonnet 5 <noreply@anthropic.com>
</commit_message>
<xml_diff>
--- a/Sumiran-Lite-Technical-Documentation.docx
+++ b/Sumiran-Lite-Technical-Documentation.docx
@@ -1240,7 +1240,7 @@
     </w:p>
     <w:p>
       <w:r>
-        <w:t>Poornima detection: hasExplicitPoornima() checks the notes field, case-insensitively, for “poornima”, “purnima”, or the Devanagari पूर्णिमा, and shows a 🌕 marker if found. This is the only detection mechanism — an earlier static-calendar fallback (poornima.json, consulted by an isTodayPoornima() helper) has been removed: it was dead code, since its only caller was an unreachable branch of renderTodayCard() (ensureTodayEntryExists() guarantees a real entry always exists by the time that function runs).</w:t>
+        <w:t>Poornima detection: hasExplicitPoornima() checks the notes field, case-insensitively for the English spellings, for “poornima”, “purnima”, the Devanagari पूर्णिमा, or the Bangla পূর্ণিমা, and shows a 🌕 marker if found. This is the only detection mechanism — an earlier static-calendar fallback (poornima.json, consulted by an isTodayPoornima() helper) has been removed: it was dead code, since its only caller was an unreachable branch of renderTodayCard() (ensureTodayEntryExists() guarantees a real entry always exists by the time that function runs).</w:t>
       </w:r>
     </w:p>
     <w:p>
@@ -4112,7 +4112,7 @@
         <w:pStyle w:val="ListBullet"/>
       </w:pPr>
       <w:r>
-        <w:t>Poornima keyword detection across all supported variants (English + Devanagari).</w:t>
+        <w:t>Poornima keyword detection across all supported variants (English, Devanagari, and Bangla).</w:t>
       </w:r>
     </w:p>
     <w:p>
@@ -4181,7 +4181,7 @@
         <w:pStyle w:val="ListBullet"/>
       </w:pPr>
       <w:r>
-        <w:t>hasExplicitPoornima across English (case-insensitive) and Devanagari keyword variants, plus null/empty notes.</w:t>
+        <w:t>hasExplicitPoornima across English (case-insensitive), Devanagari, and Bangla keyword variants, plus null/empty notes.</w:t>
       </w:r>
     </w:p>
     <w:p>

</xml_diff>

<commit_message>
Fix documentation drift found in the second audit round
- CLAUDE.md: correct the splash storage target (100-150KB -> actual
  250KB/SPLASH_TARGET_BYTES), add appLanguage/lastSundayBackupPromptDate to
  the localStorage key enumeration, update todayISO/milestone-history/i18n
  fallback descriptions to reflect this round's fixes, and refresh the
  assertion count
- app.js: fix the same 100-150KB comment drift at its source
- README.md: refresh the stale assertion count
- Technical-Documentation.docx: fix the stale "five suites/195 assertions"
  intro and separately-wrong "274 assertions" run instructions (both now
  295/7 suites), the broken "See Table 2" cross-reference (no such table
  exists), the 100-150KB storage figure, and the version header
- User-Guide.docx: restamp the version header to this branch's actual
  commit (the page-break-only formatting changes already in the working
  tree are preserved)

Co-Authored-By: Claude Sonnet 5 <noreply@anthropic.com>
</commit_message>
<xml_diff>
--- a/Sumiran-Lite-Technical-Documentation.docx
+++ b/Sumiran-Lite-Technical-Documentation.docx
@@ -37,7 +37,7 @@
           <w:color w:val="555555"/>
           <w:sz w:val="22"/>
         </w:rPr>
-        <w:t>Version: main @ d0f5926 (Sumiran-Lite)</w:t>
+        <w:t>Version: main @ afefabd (Sumiran-Lite)</w:t>
         <w:br/>
         <w:t>Generated: 08 August 2026</w:t>
         <w:br/>
@@ -1049,7 +1049,7 @@
     </w:p>
     <w:p>
       <w:r>
-        <w:t>localStorage holds display preferences and custom splash image data — never ledger practice data. See Table 2 for the full key reference, including the custom-splash-image keys added in §7.10.</w:t>
+        <w:t>localStorage holds display preferences and custom splash image data — never ledger practice data. Keys in use: malaViewEnabled, backgroundChoice, lastSplashImage, splashImage:custom0..custom3 (§7.10), appLanguage, and lastSundayBackupPromptDate.</w:t>
       </w:r>
     </w:p>
     <w:p>
@@ -1489,7 +1489,7 @@
         <w:pStyle w:val="ListBullet"/>
       </w:pPr>
       <w:r>
-        <w:t>Storage: after processing, every stored image is roughly 100–150KB regardless of the original photo's size, so total localStorage usage and the app's startup performance are unaffected by what the user uploads.</w:t>
+        <w:t>Storage: after processing, every stored image is roughly 250KB regardless of the original photo's size, so total localStorage usage and the app's startup performance are unaffected by what the user uploads.</w:t>
       </w:r>
     </w:p>
     <w:p>
@@ -4051,7 +4051,7 @@
     </w:p>
     <w:p>
       <w:r>
-        <w:t>The test suite lives under tests/ and is split into five Puppeteer-driven Node scripts (devDependency-only — none of this ships to the browser), all run against a locally served copy of the app (http://localhost:3333 by default): tests/test.js, tests/test-unit.js, tests/test-e2e.js, tests/test-redesign.js, and tests/test-splash-custom.js. 195 assertions pass across the full suite as of this revision.</w:t>
+        <w:t>The test suite lives under tests/ and is split into seven Puppeteer-driven Node scripts (devDependency-only — none of this ships to the browser), all run against a locally served copy of the app (http://localhost:3333 by default): tests/test.js, tests/test-unit.js, tests/test-e2e.js, tests/test-redesign.js, tests/test-splash-custom.js, tests/test-sunday-backup.js, and tests/test-i18n.js. 295 assertions pass across the full suite as of this revision.</w:t>
       </w:r>
     </w:p>
     <w:p>
@@ -4501,7 +4501,7 @@
     </w:p>
     <w:p>
       <w:r>
-        <w:t>Run the full suite with: npm test (equivalent to node tests/test.js &amp;&amp; node tests/test-unit.js &amp;&amp; node tests/test-e2e.js &amp;&amp; node tests/test-redesign.js &amp;&amp; node tests/test-splash-custom.js &amp;&amp; node tests/test-sunday-backup.js &amp;&amp; node tests/test-i18n.js). As of this writing, the full run totals 274 assertions across all 7 suites, 0 failures. A local server (python -m http.server 3333) must already be running in another terminal. Each file can also be run individually, e.g. node tests/test-unit.js.</w:t>
+        <w:t>Run the full suite with: npm test (equivalent to node tests/test.js &amp;&amp; node tests/test-unit.js &amp;&amp; node tests/test-e2e.js &amp;&amp; node tests/test-redesign.js &amp;&amp; node tests/test-splash-custom.js &amp;&amp; node tests/test-sunday-backup.js &amp;&amp; node tests/test-i18n.js). As of this writing, the full run totals 295 assertions across all 7 suites, 0 failures. A local server (python -m http.server 3333) must already be running in another terminal. Each file can also be run individually, e.g. node tests/test-unit.js.</w:t>
       </w:r>
     </w:p>
     <w:p>

</xml_diff>

<commit_message>
Document Batch 4 (notes search, on this day)
- Technical Documentation: new §7.17 Notes Search & On This Day (plus TOC
  entry), covering why matching runs against ledgerData rather than
  rendered rows -- the lazy year build means a DOM filter would find
  nothing in exactly the years a long-time user searches -- why the query
  is module-level, why focus/caret are restored on each debounced
  keystroke, and why result rows are read-only. Assertion count 378 -> 406.
- User Guide: a line in §4 for the "on this day" memory (including that it
  only appears when there is something to recall), and one in §8 for the
  search box, written as "find something you wrote" rather than in terms of
  filters or queries.
- Both version headers restamped to this branch's code commit.

Co-Authored-By: Claude Opus 5 <noreply@anthropic.com>
</commit_message>
<xml_diff>
--- a/Sumiran-Lite-Technical-Documentation.docx
+++ b/Sumiran-Lite-Technical-Documentation.docx
@@ -37,7 +37,7 @@
           <w:color w:val="555555"/>
           <w:sz w:val="22"/>
         </w:rPr>
-        <w:t>Version: main @ f689788 (Sumiran-Lite)</w:t>
+        <w:t>Version: main @ dab6a97 (Sumiran-Lite)</w:t>
         <w:br/>
         <w:t>Generated: 08 August 2026</w:t>
         <w:br/>
@@ -184,6 +184,12 @@
       <w:pPr/>
       <w:r>
         <w:t>7.16 Text Size &amp; Text Selection</w:t>
+      </w:r>
+    </w:p>
+    <w:p>
+      <w:pPr/>
+      <w:r>
+        <w:t>7.17 Notes Search &amp; On This Day</w:t>
       </w:r>
     </w:p>
     <w:p>
@@ -1790,6 +1796,32 @@
     </w:p>
     <w:p>
       <w:pPr>
+        <w:pStyle w:val="Heading2"/>
+      </w:pPr>
+      <w:r>
+        <w:t>7.17 Notes Search &amp; On This Day</w:t>
+      </w:r>
+    </w:p>
+    <w:p>
+      <w:pPr/>
+      <w:r>
+        <w:t>A search box sits above the Ledger List. While it holds a query, renderLedgerList() returns early and renders a flat, newest-first list of entries whose notes contain the term (case-insensitive) instead of the usual year accordions and jump-to-year bar; clearing the box restores them. Matching is done by the pure searchLedgerNotes(entries, query) against ledgerData — deliberately not by filtering rendered rows, because non-current years have no row DOM until they are expanded (§7.3), so a DOM-based filter would silently find nothing in exactly the years a long-time user is most likely searching.</w:t>
+      </w:r>
+    </w:p>
+    <w:p>
+      <w:pPr/>
+      <w:r>
+        <w:t>The query is held in a module-level ledgerSearchQuery rather than read from the input, because renderLedgerList() is rebuilt by every save, Mala View toggle and language switch — a local would drop the user back to the full ledger mid-search. Input is debounced at 200ms, and because the box itself is destroyed and recreated by each re-render, focus and caret position are restored explicitly afterwards; without that the user types one character and then into a dead field. Result rows are read-only by design: keeping the 7-day editable window, its save handlers and the milestone re-check in a single renderer (buildYearRows) is worth more than in-place editing from search results, which remain reachable by clearing the search.</w:t>
+      </w:r>
+    </w:p>
+    <w:p>
+      <w:pPr/>
+      <w:r>
+        <w:t>“On this day” adds one quiet line to the Today Card recalling what was logged on the same calendar day in an earlier year. getOnThisDayEntry(referenceISO) matches on MM-DD across earlier years, ignores null and zero-jaap days (a zero day is not a memory worth surfacing), and returns the nearest qualifying year along with how many years back it was. When it returns null the line is omitted entirely rather than rendered empty, so a newer sadhak never sees a hole where a memory should be; a 29 February lookup finding nothing in non-leap years is correct rather than a gap.</w:t>
+      </w:r>
+    </w:p>
+    <w:p>
+      <w:pPr>
         <w:pStyle w:val="Heading1"/>
       </w:pPr>
       <w:r>
@@ -4142,7 +4174,7 @@
     </w:p>
     <w:p>
       <w:r>
-        <w:t>The test suite lives under tests/ and is split into eight Puppeteer-driven Node scripts (devDependency-only — none of this ships to the browser), all run against a locally served copy of the app (http://localhost:3333 by default): tests/test.js, tests/test-unit.js, tests/test-e2e.js, tests/test-redesign.js, tests/test-splash-custom.js, tests/test-sunday-backup.js, tests/test-i18n.js, and tests/test-service-worker.js. 378 assertions pass across the full suite as of this revision.</w:t>
+        <w:t>The test suite lives under tests/ and is split into eight Puppeteer-driven Node scripts (devDependency-only — none of this ships to the browser), all run against a locally served copy of the app (http://localhost:3333 by default): tests/test.js, tests/test-unit.js, tests/test-e2e.js, tests/test-redesign.js, tests/test-splash-custom.js, tests/test-sunday-backup.js, tests/test-i18n.js, and tests/test-service-worker.js. 406 assertions pass across the full suite as of this revision.</w:t>
       </w:r>
     </w:p>
     <w:p>
@@ -4592,7 +4624,7 @@
     </w:p>
     <w:p>
       <w:r>
-        <w:t>Run the full suite with: npm test (equivalent to node tests/test.js &amp;&amp; node tests/test-unit.js &amp;&amp; node tests/test-e2e.js &amp;&amp; node tests/test-redesign.js &amp;&amp; node tests/test-splash-custom.js &amp;&amp; node tests/test-sunday-backup.js &amp;&amp; node tests/test-i18n.js &amp;&amp; node tests/test-service-worker.js). As of this writing, the full run totals 378 assertions across all 8 suites, 0 failures. A local server (python -m http.server 3333) must already be running in another terminal. Each file can also be run individually, e.g. node tests/test-unit.js.</w:t>
+        <w:t>Run the full suite with: npm test (equivalent to node tests/test.js &amp;&amp; node tests/test-unit.js &amp;&amp; node tests/test-e2e.js &amp;&amp; node tests/test-redesign.js &amp;&amp; node tests/test-splash-custom.js &amp;&amp; node tests/test-sunday-backup.js &amp;&amp; node tests/test-i18n.js &amp;&amp; node tests/test-service-worker.js). As of this writing, the full run totals 406 assertions across all 8 suites, 0 failures. A local server (python -m http.server 3333) must already be running in another terminal. Each file can also be run individually, e.g. node tests/test-unit.js.</w:t>
       </w:r>
     </w:p>
     <w:p>

</xml_diff>

<commit_message>
Correct the assertion count after the share-card rollback
The structural service-worker guards added after Batch 4 brought the suite
to 408, but the docs still said 406 -- the count last written when Batch 4
merged. Small, but assertion-count drift is exactly what the earlier audit
rounds kept finding.

Co-Authored-By: Claude Opus 5 <noreply@anthropic.com>
</commit_message>
<xml_diff>
--- a/Sumiran-Lite-Technical-Documentation.docx
+++ b/Sumiran-Lite-Technical-Documentation.docx
@@ -4174,7 +4174,7 @@
     </w:p>
     <w:p>
       <w:r>
-        <w:t>The test suite lives under tests/ and is split into eight Puppeteer-driven Node scripts (devDependency-only — none of this ships to the browser), all run against a locally served copy of the app (http://localhost:3333 by default): tests/test.js, tests/test-unit.js, tests/test-e2e.js, tests/test-redesign.js, tests/test-splash-custom.js, tests/test-sunday-backup.js, tests/test-i18n.js, and tests/test-service-worker.js. 406 assertions pass across the full suite as of this revision.</w:t>
+        <w:t>The test suite lives under tests/ and is split into eight Puppeteer-driven Node scripts (devDependency-only — none of this ships to the browser), all run against a locally served copy of the app (http://localhost:3333 by default): tests/test.js, tests/test-unit.js, tests/test-e2e.js, tests/test-redesign.js, tests/test-splash-custom.js, tests/test-sunday-backup.js, tests/test-i18n.js, and tests/test-service-worker.js. 408 assertions pass across the full suite as of this revision.</w:t>
       </w:r>
     </w:p>
     <w:p>
@@ -4624,7 +4624,7 @@
     </w:p>
     <w:p>
       <w:r>
-        <w:t>Run the full suite with: npm test (equivalent to node tests/test.js &amp;&amp; node tests/test-unit.js &amp;&amp; node tests/test-e2e.js &amp;&amp; node tests/test-redesign.js &amp;&amp; node tests/test-splash-custom.js &amp;&amp; node tests/test-sunday-backup.js &amp;&amp; node tests/test-i18n.js &amp;&amp; node tests/test-service-worker.js). As of this writing, the full run totals 406 assertions across all 8 suites, 0 failures. A local server (python -m http.server 3333) must already be running in another terminal. Each file can also be run individually, e.g. node tests/test-unit.js.</w:t>
+        <w:t>Run the full suite with: npm test (equivalent to node tests/test.js &amp;&amp; node tests/test-unit.js &amp;&amp; node tests/test-e2e.js &amp;&amp; node tests/test-redesign.js &amp;&amp; node tests/test-splash-custom.js &amp;&amp; node tests/test-sunday-backup.js &amp;&amp; node tests/test-i18n.js &amp;&amp; node tests/test-service-worker.js). As of this writing, the full run totals 408 assertions across all 8 suites, 0 failures. A local server (python -m http.server 3333) must already be running in another terminal. Each file can also be run individually, e.g. node tests/test-unit.js.</w:t>
       </w:r>
     </w:p>
     <w:p>

</xml_diff>

<commit_message>
Document the milestone ordering, and finish the Mala Mode doc pass
Records that the Reflection Card's milestone list reads newest first while
getMilestoneHistory() still returns ascending order - the part a future reader
would otherwise be tempted to "tidy" by reversing the source array, which is
shared with renderLedgerList().

Also closes two gaps left over from the Mala Mode release: CLAUDE.md's
run-a-single-suite block never gained test-mala-mode.js, and the assertion
counts in CLAUDE.md, README and the Technical Documentation were a release
behind.

Documentation only - no code changed.

Co-Authored-By: Claude Opus 5 <noreply@anthropic.com>
</commit_message>
<xml_diff>
--- a/Sumiran-Lite-Technical-Documentation.docx
+++ b/Sumiran-Lite-Technical-Documentation.docx
@@ -1232,7 +1232,7 @@
         <w:pStyle w:val="ListBullet"/>
       </w:pPr>
       <w:r>
-        <w:t>Full milestone history: every Crore boundary crossed, prefixed with a 🪔 diya emoji, with date and days-since-previous.</w:t>
+        <w:t>Full milestone history: every Crore boundary crossed, prefixed with a 🪔 diya emoji, with date and days-since-previous. Listed newest first, so the most recent crossing is at the top. getMilestoneHistory() itself still returns ascending order - it walks the ledger forward to compute each days-since-previous, and renderToday() passes the same array to renderLedgerList() - so the reversal is display-only and made on a copy. Each line keeps the gap to the milestone before it in TIME, not in display order.</w:t>
       </w:r>
     </w:p>
     <w:p>
@@ -4236,7 +4236,7 @@
     </w:p>
     <w:p>
       <w:r>
-        <w:t>The test suite lives under tests/ and is split into nine Puppeteer-driven Node scripts (devDependency-only — none of this ships to the browser), all run against a locally served copy of the app (http://localhost:3333 by default): tests/test.js, tests/test-unit.js, tests/test-e2e.js, tests/test-redesign.js, tests/test-splash-custom.js, tests/test-mala-mode.js, tests/test-sunday-backup.js, tests/test-i18n.js, and tests/test-service-worker.js. 511 assertions pass across the full suite as of this revision. Every browser context in every suite calls seedAppState() from tests/test-helpers.js before its first navigation - the only module the suites share. It marks today's Sunday Backup Reminder as handled; a context omitting it yields a run whose result depends on the day of the week, since that modal covers the app at z-index 9800 and swallows clicks meant for anything beneath it.</w:t>
+        <w:t>The test suite lives under tests/ and is split into nine Puppeteer-driven Node scripts (devDependency-only — none of this ships to the browser), all run against a locally served copy of the app (http://localhost:3333 by default): tests/test.js, tests/test-unit.js, tests/test-e2e.js, tests/test-redesign.js, tests/test-splash-custom.js, tests/test-mala-mode.js, tests/test-sunday-backup.js, tests/test-i18n.js, and tests/test-service-worker.js. 514 assertions pass across the full suite as of this revision. Every browser context in every suite calls seedAppState() from tests/test-helpers.js before its first navigation - the only module the suites share. It marks today's Sunday Backup Reminder as handled; a context omitting it yields a run whose result depends on the day of the week, since that modal covers the app at z-index 9800 and swallows clicks meant for anything beneath it.</w:t>
       </w:r>
     </w:p>
     <w:p>
@@ -4700,7 +4700,7 @@
     </w:p>
     <w:p>
       <w:r>
-        <w:t>Run the full suite with: npm test (equivalent to node tests/test.js &amp;&amp; node tests/test-unit.js &amp;&amp; node tests/test-e2e.js &amp;&amp; node tests/test-redesign.js &amp;&amp; node tests/test-splash-custom.js &amp;&amp; node tests/test-mala-mode.js &amp;&amp; node tests/test-sunday-backup.js &amp;&amp; node tests/test-i18n.js &amp;&amp; node tests/test-service-worker.js). As of this writing, the full run totals 511 assertions across all 9 suites, 0 failures. A local server (python -m http.server 3333) must already be running in another terminal. Each file can also be run individually, e.g. node tests/test-unit.js.</w:t>
+        <w:t>Run the full suite with: npm test (equivalent to node tests/test.js &amp;&amp; node tests/test-unit.js &amp;&amp; node tests/test-e2e.js &amp;&amp; node tests/test-redesign.js &amp;&amp; node tests/test-splash-custom.js &amp;&amp; node tests/test-mala-mode.js &amp;&amp; node tests/test-sunday-backup.js &amp;&amp; node tests/test-i18n.js &amp;&amp; node tests/test-service-worker.js). As of this writing, the full run totals 514 assertions across all 9 suites, 0 failures. A local server (python -m http.server 3333) must already be running in another terminal. Each file can also be run individually, e.g. node tests/test-unit.js.</w:t>
       </w:r>
     </w:p>
     <w:p>

</xml_diff>